<commit_message>
Import module 대본 추가
</commit_message>
<xml_diff>
--- a/docs/제출용/종합설계/Product_Backlog_2팀.docx
+++ b/docs/제출용/종합설계/Product_Backlog_2팀.docx
@@ -111,19 +111,11 @@
                 <w:rFonts w:ascii="맑은 고딕" w:eastAsia="맑은 고딕" w:hAnsi="맑은 고딕"/>
               </w:rPr>
             </w:pPr>
-            <w:proofErr w:type="spellStart"/>
             <w:r>
               <w:rPr>
                 <w:rFonts w:ascii="맑은 고딕" w:eastAsia="맑은 고딕" w:hAnsi="맑은 고딕"/>
               </w:rPr>
-              <w:t>SafeCrowd</w:t>
-            </w:r>
-            <w:proofErr w:type="spellEnd"/>
-            <w:r>
-              <w:rPr>
-                <w:rFonts w:ascii="맑은 고딕" w:eastAsia="맑은 고딕" w:hAnsi="맑은 고딕"/>
-              </w:rPr>
-              <w:t>: 군중 안전 시뮬레이터</w:t>
+              <w:t>SafeCrowd: 군중 안전 시뮬레이터</w:t>
             </w:r>
           </w:p>
         </w:tc>
@@ -201,16 +193,8 @@
         <w:rPr>
           <w:rFonts w:ascii="맑은 고딕" w:eastAsia="맑은 고딕" w:hAnsi="맑은 고딕"/>
         </w:rPr>
-        <w:t xml:space="preserve">202202546 </w:t>
-      </w:r>
-      <w:proofErr w:type="spellStart"/>
-      <w:r>
-        <w:rPr>
-          <w:rFonts w:ascii="맑은 고딕" w:eastAsia="맑은 고딕" w:hAnsi="맑은 고딕"/>
-        </w:rPr>
-        <w:t>금소현</w:t>
-      </w:r>
-      <w:proofErr w:type="spellEnd"/>
+        <w:t>202202546 금소현</w:t>
+      </w:r>
     </w:p>
     <w:p>
       <w:pPr>
@@ -521,6 +505,12 @@
                 <w:rFonts w:ascii="맑은 고딕" w:eastAsia="맑은 고딕" w:hAnsi="맑은 고딕"/>
               </w:rPr>
             </w:pPr>
+            <w:r>
+              <w:rPr>
+                <w:rFonts w:ascii="맑은 고딕" w:eastAsia="맑은 고딕" w:hAnsi="맑은 고딕" w:hint="eastAsia"/>
+              </w:rPr>
+              <w:t>3</w:t>
+            </w:r>
           </w:p>
         </w:tc>
         <w:tc>
@@ -533,6 +523,12 @@
                 <w:rFonts w:ascii="맑은 고딕" w:eastAsia="맑은 고딕" w:hAnsi="맑은 고딕"/>
               </w:rPr>
             </w:pPr>
+            <w:r>
+              <w:rPr>
+                <w:rFonts w:ascii="맑은 고딕" w:eastAsia="맑은 고딕" w:hAnsi="맑은 고딕" w:hint="eastAsia"/>
+              </w:rPr>
+              <w:t>2026/04/10</w:t>
+            </w:r>
           </w:p>
         </w:tc>
         <w:tc>
@@ -545,6 +541,12 @@
                 <w:rFonts w:ascii="맑은 고딕" w:eastAsia="맑은 고딕" w:hAnsi="맑은 고딕"/>
               </w:rPr>
             </w:pPr>
+            <w:r>
+              <w:rPr>
+                <w:rFonts w:ascii="맑은 고딕" w:eastAsia="맑은 고딕" w:hAnsi="맑은 고딕" w:hint="eastAsia"/>
+              </w:rPr>
+              <w:t>교수님 피드백 반영 및 구현 내용 추가</w:t>
+            </w:r>
           </w:p>
         </w:tc>
         <w:tc>
@@ -557,6 +559,12 @@
                 <w:rFonts w:ascii="맑은 고딕" w:eastAsia="맑은 고딕" w:hAnsi="맑은 고딕"/>
               </w:rPr>
             </w:pPr>
+            <w:r>
+              <w:rPr>
+                <w:rFonts w:ascii="맑은 고딕" w:eastAsia="맑은 고딕" w:hAnsi="맑은 고딕" w:hint="eastAsia"/>
+              </w:rPr>
+              <w:t>김학찬</w:t>
+            </w:r>
           </w:p>
         </w:tc>
       </w:tr>
@@ -645,15 +653,7 @@
         <w:pStyle w:val="new1"/>
       </w:pPr>
       <w:r>
-        <w:t xml:space="preserve">Project Name: </w:t>
-      </w:r>
-      <w:proofErr w:type="spellStart"/>
-      <w:r>
-        <w:t>SafeCrowd</w:t>
-      </w:r>
-      <w:proofErr w:type="spellEnd"/>
-      <w:r>
-        <w:t>: 군중 안전 시뮬레이터</w:t>
+        <w:t>Project Name: SafeCrowd: 군중 안전 시뮬레이터</w:t>
       </w:r>
     </w:p>
     <w:p>
@@ -696,15 +696,7 @@
         </w:rPr>
       </w:pPr>
       <w:r>
-        <w:t xml:space="preserve">팀원: 은민수, 김준용, </w:t>
-      </w:r>
-      <w:proofErr w:type="spellStart"/>
-      <w:r>
-        <w:t>금소현</w:t>
-      </w:r>
-      <w:proofErr w:type="spellEnd"/>
-      <w:r>
-        <w:t>, 김학찬</w:t>
+        <w:t>팀원: 은민수, 김준용, 금소현, 김학찬</w:t>
       </w:r>
     </w:p>
     <w:p>
@@ -757,99 +749,63 @@
           <w:rFonts w:ascii="맑은 고딕" w:eastAsia="맑은 고딕" w:hAnsi="맑은 고딕"/>
         </w:rPr>
       </w:pPr>
-      <w:proofErr w:type="spellStart"/>
       <w:r>
         <w:rPr>
           <w:rFonts w:ascii="맑은 고딕" w:eastAsia="맑은 고딕" w:hAnsi="맑은 고딕"/>
         </w:rPr>
-        <w:t>SafeCrowd</w:t>
-      </w:r>
-      <w:proofErr w:type="spellEnd"/>
-      <w:r>
+        <w:t>SafeCrowd는 건물 관리자, 행사장 운영자, 안전관리자, 건축·공간 설계자, 재난 대응 담당자가 실제 공간 구조를 반영한 군중 이동 시뮬레이션을 직접 구성하고 비교할 수 있게 하는 데스크톱 시스템이다.</w:t>
+      </w:r>
+    </w:p>
+    <w:p>
+      <w:pPr>
         <w:rPr>
           <w:rFonts w:ascii="맑은 고딕" w:eastAsia="맑은 고딕" w:hAnsi="맑은 고딕"/>
         </w:rPr>
-        <w:t>는 건물 관리자, 행사장 운영자, 안전관리자, 건축·공간 설계자, 재난 대응 담당자가 실제 공간 구조를 반영한 군중 이동 시뮬레이션을 직접 구성하고 비교할 수 있게 하는 데스크톱 시스템이다.</w:t>
-      </w:r>
-    </w:p>
-    <w:p>
-      <w:pPr>
+      </w:pPr>
+      <w:r>
         <w:rPr>
           <w:rFonts w:ascii="맑은 고딕" w:eastAsia="맑은 고딕" w:hAnsi="맑은 고딕"/>
         </w:rPr>
-      </w:pPr>
-      <w:r>
+        <w:t>이 시스템은 실제 훈련을 반복하기 어려운 상황에서 병목, 정체, 압력 집중, 낙상, 역방향·교차 흐름, 탈출 지연 같은 위험을 사전에 식별하도록 돕는다.</w:t>
+      </w:r>
+    </w:p>
+    <w:p>
+      <w:pPr>
         <w:rPr>
           <w:rFonts w:ascii="맑은 고딕" w:eastAsia="맑은 고딕" w:hAnsi="맑은 고딕"/>
         </w:rPr>
-        <w:t>이 시스템은 실제 훈련을 반복하기 어려운 상황에서 병목, 정체, 압력 집중, 낙상, 역방향·교차 흐름, 탈출 지연 같은 위험을 사전에 식별하도록 돕는다.</w:t>
-      </w:r>
-    </w:p>
-    <w:p>
-      <w:pPr>
+      </w:pPr>
+      <w:r>
         <w:rPr>
           <w:rFonts w:ascii="맑은 고딕" w:eastAsia="맑은 고딕" w:hAnsi="맑은 고딕"/>
         </w:rPr>
-      </w:pPr>
-      <w:r>
+        <w:t>사용자는 DXF 등으로부터 공간 구조를 불러오고, 출구 개방·폐쇄, 통제 구역, 순차 퇴장, 시야 저하 같은 운영 조건을 손쉽게 바꿔 여러 대안 시나리오를 만든다.</w:t>
+      </w:r>
+    </w:p>
+    <w:p>
+      <w:pPr>
         <w:rPr>
           <w:rFonts w:ascii="맑은 고딕" w:eastAsia="맑은 고딕" w:hAnsi="맑은 고딕"/>
         </w:rPr>
-        <w:t>사용자는 DXF 등으로부터 공간 구조를 불러오고, 출구 개방·폐쇄, 통제 구역, 순차 퇴장, 시야 저하 같은 운영 조건을 손쉽게 바꿔 여러 대안 시나리오를 만든다.</w:t>
-      </w:r>
-    </w:p>
-    <w:p>
-      <w:pPr>
+      </w:pPr>
+      <w:r>
         <w:rPr>
           <w:rFonts w:ascii="맑은 고딕" w:eastAsia="맑은 고딕" w:hAnsi="맑은 고딕"/>
         </w:rPr>
-      </w:pPr>
-      <w:r>
+        <w:t>시스템은 각 시나리오를 반복 가능하게 실행하고, 위험 히트맵과 핵심 안전 지표를 통해 어떤 운영안과 설계안이 더 안전한지 비교 가능한 근거를 제공한다. 또한 분석 결과를 바탕으로 출구 추가 개방, 순차 퇴장, 통제 구역 재설정, 일방통행 전환 같은 운영 대안 후보를 우선순위와 근거와 함께 제안한다.</w:t>
+      </w:r>
+    </w:p>
+    <w:p>
+      <w:pPr>
         <w:rPr>
           <w:rFonts w:ascii="맑은 고딕" w:eastAsia="맑은 고딕" w:hAnsi="맑은 고딕"/>
         </w:rPr>
-        <w:t xml:space="preserve">시스템은 각 시나리오를 반복 가능하게 실행하고, 위험 </w:t>
-      </w:r>
-      <w:proofErr w:type="spellStart"/>
+      </w:pPr>
       <w:r>
         <w:rPr>
           <w:rFonts w:ascii="맑은 고딕" w:eastAsia="맑은 고딕" w:hAnsi="맑은 고딕"/>
         </w:rPr>
-        <w:t>히트맵과</w:t>
-      </w:r>
-      <w:proofErr w:type="spellEnd"/>
-      <w:r>
-        <w:rPr>
-          <w:rFonts w:ascii="맑은 고딕" w:eastAsia="맑은 고딕" w:hAnsi="맑은 고딕"/>
-        </w:rPr>
-        <w:t xml:space="preserve"> 핵심 안전 지표를 통해 어떤 운영안과 설계안이 더 안전한지 비교 가능한 근거를 제공한다. 또한 분석 결과를 바탕으로 출구 추가 개방, 순차 퇴장, 통제 구역 재설정, 일방통행 전환 같은 운영 대안 후보를 우선순위와 근거와 함께 제안한다.</w:t>
-      </w:r>
-    </w:p>
-    <w:p>
-      <w:pPr>
-        <w:rPr>
-          <w:rFonts w:ascii="맑은 고딕" w:eastAsia="맑은 고딕" w:hAnsi="맑은 고딕"/>
-        </w:rPr>
-      </w:pPr>
-      <w:r>
-        <w:rPr>
-          <w:rFonts w:ascii="맑은 고딕" w:eastAsia="맑은 고딕" w:hAnsi="맑은 고딕"/>
-        </w:rPr>
-        <w:t xml:space="preserve">궁극적으로 </w:t>
-      </w:r>
-      <w:proofErr w:type="spellStart"/>
-      <w:r>
-        <w:rPr>
-          <w:rFonts w:ascii="맑은 고딕" w:eastAsia="맑은 고딕" w:hAnsi="맑은 고딕"/>
-        </w:rPr>
-        <w:t>SafeCrowd</w:t>
-      </w:r>
-      <w:proofErr w:type="spellEnd"/>
-      <w:r>
-        <w:rPr>
-          <w:rFonts w:ascii="맑은 고딕" w:eastAsia="맑은 고딕" w:hAnsi="맑은 고딕"/>
-        </w:rPr>
-        <w:t>는 전문가 전용 범용 시뮬레이터가 아니라, 비전문가도 이해 가능한 UI와 설명 가능한 위험 지표를 갖춘 안전 의사결정 지원 도구를 목표로 한다.</w:t>
+        <w:t>궁극적으로 SafeCrowd는 전문가 전용 범용 시뮬레이터가 아니라, 비전문가도 이해 가능한 UI와 설명 가능한 위험 지표를 갖춘 안전 의사결정 지원 도구를 목표로 한다.</w:t>
       </w:r>
     </w:p>
     <w:p>
@@ -886,21 +842,7 @@
         <w:rPr>
           <w:rFonts w:hint="eastAsia"/>
         </w:rPr>
-        <w:t xml:space="preserve">하나의 공간 도면으로 </w:t>
-      </w:r>
-      <w:proofErr w:type="spellStart"/>
-      <w:r>
-        <w:rPr>
-          <w:rFonts w:hint="eastAsia"/>
-        </w:rPr>
-        <w:t>기준안</w:t>
-      </w:r>
-      <w:proofErr w:type="spellEnd"/>
-      <w:r>
-        <w:rPr>
-          <w:rFonts w:hint="eastAsia"/>
-        </w:rPr>
-        <w:t xml:space="preserve"> 1개와 대안 2개 이상을 구성하고 비교할 수 있다.</w:t>
+        <w:t>하나의 공간 도면으로 기준안 1개와 대안 2개 이상을 구성하고 비교할 수 있다.</w:t>
       </w:r>
     </w:p>
     <w:p>
@@ -916,15 +858,7 @@
         <w:pStyle w:val="new1"/>
       </w:pPr>
       <w:r>
-        <w:t xml:space="preserve">총 대피 시간, 90%·95% 대피 시간, 최대 밀도, 압박 위험, 낙상, </w:t>
-      </w:r>
-      <w:proofErr w:type="spellStart"/>
-      <w:r>
-        <w:t>미대피</w:t>
-      </w:r>
-      <w:proofErr w:type="spellEnd"/>
-      <w:r>
-        <w:t xml:space="preserve"> 인원 등 핵심 안전 지표 6종 이상을 자동 산출한다.</w:t>
+        <w:t>총 대피 시간, 90%·95% 대피 시간, 최대 밀도, 압박 위험, 낙상, 미대피 인원 등 핵심 안전 지표 6종 이상을 자동 산출한다.</w:t>
       </w:r>
     </w:p>
     <w:p>
@@ -932,15 +866,7 @@
         <w:pStyle w:val="new1"/>
       </w:pPr>
       <w:r>
-        <w:t xml:space="preserve">위험 </w:t>
-      </w:r>
-      <w:proofErr w:type="spellStart"/>
-      <w:r>
-        <w:t>히트맵으로</w:t>
-      </w:r>
-      <w:proofErr w:type="spellEnd"/>
-      <w:r>
-        <w:t xml:space="preserve"> 시나리오별 위험 구역과 변화 정도를 직관적으로 비교할 수 있다.</w:t>
+        <w:t>위험 히트맵으로 시나리오별 위험 구역과 변화 정도를 직관적으로 비교할 수 있다.</w:t>
       </w:r>
     </w:p>
     <w:p>
@@ -1431,21 +1357,7 @@
               <w:rPr>
                 <w:rFonts w:ascii="맑은 고딕" w:eastAsia="맑은 고딕" w:hAnsi="맑은 고딕"/>
               </w:rPr>
-              <w:t xml:space="preserve">위험 </w:t>
-            </w:r>
-            <w:proofErr w:type="spellStart"/>
-            <w:r>
-              <w:rPr>
-                <w:rFonts w:ascii="맑은 고딕" w:eastAsia="맑은 고딕" w:hAnsi="맑은 고딕"/>
-              </w:rPr>
-              <w:t>히트맵과</w:t>
-            </w:r>
-            <w:proofErr w:type="spellEnd"/>
-            <w:r>
-              <w:rPr>
-                <w:rFonts w:ascii="맑은 고딕" w:eastAsia="맑은 고딕" w:hAnsi="맑은 고딕"/>
-              </w:rPr>
-              <w:t xml:space="preserve"> 비교 지표를 통해 현재 상태와 대안 간 차이를 이해하게 한다.</w:t>
+              <w:t>위험 히트맵과 비교 지표를 통해 현재 상태와 대안 간 차이를 이해하게 한다.</w:t>
             </w:r>
           </w:p>
         </w:tc>
@@ -1850,23 +1762,7 @@
           <w:b w:val="0"/>
           <w:bCs w:val="0"/>
         </w:rPr>
-        <w:t xml:space="preserve">건축·공간 설계자로서 </w:t>
-      </w:r>
-      <w:proofErr w:type="spellStart"/>
-      <w:r>
-        <w:rPr>
-          <w:b w:val="0"/>
-          <w:bCs w:val="0"/>
-        </w:rPr>
-        <w:t>임포트된</w:t>
-      </w:r>
-      <w:proofErr w:type="spellEnd"/>
-      <w:r>
-        <w:rPr>
-          <w:b w:val="0"/>
-          <w:bCs w:val="0"/>
-        </w:rPr>
-        <w:t xml:space="preserve"> 구조에서 어떤 요소가 누락되었고 무엇이 위험한지 검토하고 싶다. 그래야 잘못된 공간 모델로 시뮬레이션을 진행하지 않을 수 있다.</w:t>
+        <w:t>건축·공간 설계자로서 임포트된 구조에서 어떤 요소가 누락되었고 무엇이 위험한지 검토하고 싶다. 그래야 잘못된 공간 모델로 시뮬레이션을 진행하지 않을 수 있다.</w:t>
       </w:r>
     </w:p>
     <w:p>
@@ -1893,13 +1789,8 @@
           <w:numId w:val="30"/>
         </w:numPr>
       </w:pPr>
-      <w:proofErr w:type="spellStart"/>
-      <w:r>
-        <w:t>임포트</w:t>
-      </w:r>
-      <w:proofErr w:type="spellEnd"/>
-      <w:r>
-        <w:t xml:space="preserve"> 결과에 문제가 있을 때, 검토 화면을 열면, 오류와 경고가 구분되어 표시된다.</w:t>
+      <w:r>
+        <w:t>임포트 결과에 문제가 있을 때, 검토 화면을 열면, 오류와 경고가 구분되어 표시된다.</w:t>
       </w:r>
     </w:p>
     <w:p>
@@ -2044,23 +1935,7 @@
           <w:b w:val="0"/>
           <w:bCs w:val="0"/>
         </w:rPr>
-        <w:t xml:space="preserve">시설 관리자로서 </w:t>
-      </w:r>
-      <w:proofErr w:type="spellStart"/>
-      <w:r>
-        <w:rPr>
-          <w:b w:val="0"/>
-          <w:bCs w:val="0"/>
-        </w:rPr>
-        <w:t>임포트</w:t>
-      </w:r>
-      <w:proofErr w:type="spellEnd"/>
-      <w:r>
-        <w:rPr>
-          <w:b w:val="0"/>
-          <w:bCs w:val="0"/>
-        </w:rPr>
-        <w:t xml:space="preserve"> 결과를 수동으로 보정하고 시뮬레이션 가능 상태를 확정하고 싶다. 그래야 실제 도면의 불완전함 때문에 분석을 포기하지 않아도 된다.</w:t>
+        <w:t>시설 관리자로서 임포트 결과를 수동으로 보정하고 시뮬레이션 가능 상태를 확정하고 싶다. 그래야 실제 도면의 불완전함 때문에 분석을 포기하지 않아도 된다.</w:t>
       </w:r>
     </w:p>
     <w:p>
@@ -2087,13 +1962,8 @@
           <w:numId w:val="29"/>
         </w:numPr>
       </w:pPr>
-      <w:proofErr w:type="spellStart"/>
-      <w:r>
-        <w:t>임포트</w:t>
-      </w:r>
-      <w:proofErr w:type="spellEnd"/>
-      <w:r>
-        <w:t xml:space="preserve"> 결과에 누락된 출구나 연결이 있을 때, 사용자가 구역, 연결, 제어 지점을 수정하면, 변경 사항이 레이아웃에 반영된다.</w:t>
+      <w:r>
+        <w:t>임포트 결과에 누락된 출구나 연결이 있을 때, 사용자가 구역, 연결, 제어 지점을 수정하면, 변경 사항이 레이아웃에 반영된다.</w:t>
       </w:r>
     </w:p>
     <w:p>
@@ -2909,23 +2779,7 @@
           <w:b w:val="0"/>
           <w:bCs w:val="0"/>
         </w:rPr>
-        <w:t xml:space="preserve">안전관리자로서 같은 시나리오를 같은 조건으로 다시 실행하거나 여러 번 반복 실행하고 싶다. 그래야 결과가 </w:t>
-      </w:r>
-      <w:proofErr w:type="spellStart"/>
-      <w:r>
-        <w:rPr>
-          <w:b w:val="0"/>
-          <w:bCs w:val="0"/>
-        </w:rPr>
-        <w:t>일관적인지와</w:t>
-      </w:r>
-      <w:proofErr w:type="spellEnd"/>
-      <w:r>
-        <w:rPr>
-          <w:b w:val="0"/>
-          <w:bCs w:val="0"/>
-        </w:rPr>
-        <w:t xml:space="preserve"> 변동 범위를 함께 확인할 수 있다.</w:t>
+        <w:t>안전관리자로서 같은 시나리오를 같은 조건으로 다시 실행하거나 여러 번 반복 실행하고 싶다. 그래야 결과가 일관적인지와 변동 범위를 함께 확인할 수 있다.</w:t>
       </w:r>
     </w:p>
     <w:p>
@@ -3446,15 +3300,7 @@
         </w:numPr>
       </w:pPr>
       <w:r>
-        <w:t xml:space="preserve">압박 위험은 주의, 높음, 매우 </w:t>
-      </w:r>
-      <w:proofErr w:type="spellStart"/>
-      <w:r>
-        <w:t>높음처럼</w:t>
-      </w:r>
-      <w:proofErr w:type="spellEnd"/>
-      <w:r>
-        <w:t xml:space="preserve"> 구분된 수준으로 표시된다.</w:t>
+        <w:t>압박 위험은 주의, 높음, 매우 높음처럼 구분된 수준으로 표시된다.</w:t>
       </w:r>
     </w:p>
     <w:p>
@@ -3841,11 +3687,9 @@
       <w:r>
         <w:t xml:space="preserve"> </w:t>
       </w:r>
-      <w:proofErr w:type="spellStart"/>
       <w:r>
         <w:t>길찾기</w:t>
       </w:r>
-      <w:proofErr w:type="spellEnd"/>
       <w:r>
         <w:t xml:space="preserve"> </w:t>
       </w:r>
@@ -3886,23 +3730,7 @@
           <w:bCs w:val="0"/>
         </w:rPr>
         <w:lastRenderedPageBreak/>
-        <w:t xml:space="preserve">재난 대응 담당자로서 연기나 시야 저하가 </w:t>
-      </w:r>
-      <w:proofErr w:type="spellStart"/>
-      <w:r>
-        <w:rPr>
-          <w:b w:val="0"/>
-          <w:bCs w:val="0"/>
-        </w:rPr>
-        <w:t>길찾기와</w:t>
-      </w:r>
-      <w:proofErr w:type="spellEnd"/>
-      <w:r>
-        <w:rPr>
-          <w:b w:val="0"/>
-          <w:bCs w:val="0"/>
-        </w:rPr>
-        <w:t xml:space="preserve"> 이동 성능에 미치는 영향을 반영하고 싶다. 그래야 평시 시나리오와 비상 시나리오를 같은 조건으로 비교하지 않게 된다.</w:t>
+        <w:t>재난 대응 담당자로서 연기나 시야 저하가 길찾기와 이동 성능에 미치는 영향을 반영하고 싶다. 그래야 평시 시나리오와 비상 시나리오를 같은 조건으로 비교하지 않게 된다.</w:t>
       </w:r>
     </w:p>
     <w:p>
@@ -4050,11 +3878,9 @@
       <w:r>
         <w:t xml:space="preserve"> </w:t>
       </w:r>
-      <w:proofErr w:type="spellStart"/>
       <w:r>
         <w:t>히트맵</w:t>
       </w:r>
-      <w:proofErr w:type="spellEnd"/>
       <w:r>
         <w:t xml:space="preserve"> </w:t>
       </w:r>
@@ -4088,23 +3914,7 @@
           <w:b w:val="0"/>
           <w:bCs w:val="0"/>
         </w:rPr>
-        <w:t xml:space="preserve">건축·공간 설계자로서 위험이 집중되는 위치를 </w:t>
-      </w:r>
-      <w:proofErr w:type="spellStart"/>
-      <w:r>
-        <w:rPr>
-          <w:b w:val="0"/>
-          <w:bCs w:val="0"/>
-        </w:rPr>
-        <w:t>히트맵으로</w:t>
-      </w:r>
-      <w:proofErr w:type="spellEnd"/>
-      <w:r>
-        <w:rPr>
-          <w:b w:val="0"/>
-          <w:bCs w:val="0"/>
-        </w:rPr>
-        <w:t xml:space="preserve"> 보고 싶다. 그래야 숫자만으로는 놓치기 쉬운 위험 구역을 직관적으로 파악할 수 있다.</w:t>
+        <w:t>건축·공간 설계자로서 위험이 집중되는 위치를 히트맵으로 보고 싶다. 그래야 숫자만으로는 놓치기 쉬운 위험 구역을 직관적으로 파악할 수 있다.</w:t>
       </w:r>
     </w:p>
     <w:p>
@@ -4132,15 +3942,7 @@
         </w:numPr>
       </w:pPr>
       <w:r>
-        <w:t xml:space="preserve">시뮬레이션이 실행 중이거나 종료되면, 사용자가 표시 항목을 선택하면, 해당 </w:t>
-      </w:r>
-      <w:proofErr w:type="spellStart"/>
-      <w:r>
-        <w:t>히트맵을</w:t>
-      </w:r>
-      <w:proofErr w:type="spellEnd"/>
-      <w:r>
-        <w:t xml:space="preserve"> 볼 수 있다.</w:t>
+        <w:t>시뮬레이션이 실행 중이거나 종료되면, 사용자가 표시 항목을 선택하면, 해당 히트맵을 볼 수 있다.</w:t>
       </w:r>
     </w:p>
     <w:p>
@@ -4164,15 +3966,7 @@
         </w:numPr>
       </w:pPr>
       <w:r>
-        <w:t xml:space="preserve">위험이 집중된 구역이 있으면, </w:t>
-      </w:r>
-      <w:proofErr w:type="spellStart"/>
-      <w:r>
-        <w:t>히트맵을</w:t>
-      </w:r>
-      <w:proofErr w:type="spellEnd"/>
-      <w:r>
-        <w:t xml:space="preserve"> 보면, 위치와 강도가 색상 단계로 구분된다.</w:t>
+        <w:t>위험이 집중된 구역이 있으면, 히트맵을 보면, 위치와 강도가 색상 단계로 구분된다.</w:t>
       </w:r>
     </w:p>
     <w:p>
@@ -4184,15 +3978,7 @@
         </w:numPr>
       </w:pPr>
       <w:r>
-        <w:t xml:space="preserve">시나리오가 다르면, 각 </w:t>
-      </w:r>
-      <w:proofErr w:type="spellStart"/>
-      <w:r>
-        <w:t>히트맵을</w:t>
-      </w:r>
-      <w:proofErr w:type="spellEnd"/>
-      <w:r>
-        <w:t xml:space="preserve"> 비교하면, 위험 구역의 위치와 강도 차이를 확인할 수 있다.</w:t>
+        <w:t>시나리오가 다르면, 각 히트맵을 비교하면, 위험 구역의 위치와 강도 차이를 확인할 수 있다.</w:t>
       </w:r>
     </w:p>
     <w:p>
@@ -4317,15 +4103,7 @@
         </w:numPr>
       </w:pPr>
       <w:r>
-        <w:t xml:space="preserve">시뮬레이션이 완료되면, 결과 요약을 열면, 총 대피 시간, 전체 인원의 50%, 90%, 95%가 대피를 마친 시점의 시간, </w:t>
-      </w:r>
-      <w:proofErr w:type="spellStart"/>
-      <w:r>
-        <w:t>미대피</w:t>
-      </w:r>
-      <w:proofErr w:type="spellEnd"/>
-      <w:r>
-        <w:t xml:space="preserve"> 인원, 최대 밀도 등을 확인할 수 있다.</w:t>
+        <w:t>시뮬레이션이 완료되면, 결과 요약을 열면, 총 대피 시간, 전체 인원의 50%, 90%, 95%가 대피를 마친 시점의 시간, 미대피 인원, 최대 밀도 등을 확인할 수 있다.</w:t>
       </w:r>
     </w:p>
     <w:p>
@@ -4349,23 +4127,7 @@
         </w:numPr>
       </w:pPr>
       <w:r>
-        <w:t xml:space="preserve">반복 실행 결과가 있으면, 요약을 확인하면, 단일 </w:t>
-      </w:r>
-      <w:proofErr w:type="spellStart"/>
-      <w:r>
-        <w:t>실행값과</w:t>
-      </w:r>
-      <w:proofErr w:type="spellEnd"/>
-      <w:r>
-        <w:t xml:space="preserve"> </w:t>
-      </w:r>
-      <w:proofErr w:type="spellStart"/>
-      <w:r>
-        <w:t>집계값을</w:t>
-      </w:r>
-      <w:proofErr w:type="spellEnd"/>
-      <w:r>
-        <w:t xml:space="preserve"> 구분해서 볼 수 있다.</w:t>
+        <w:t>반복 실행 결과가 있으면, 요약을 확인하면, 단일 실행값과 집계값을 구분해서 볼 수 있다.</w:t>
       </w:r>
     </w:p>
     <w:p>
@@ -16184,7 +15946,7 @@
       <w:textAlignment w:val="baseline"/>
     </w:pPr>
     <w:rPr>
-      <w:rFonts w:ascii="함초롬바탕" w:eastAsia="굴림" w:hAnsi="굴림" w:cs="굴림"/>
+      <w:rFonts w:ascii="HCR Batang" w:eastAsia="Gulim" w:hAnsi="Gulim" w:cs="Gulim"/>
       <w:color w:val="000000"/>
       <w:kern w:val="0"/>
       <w:szCs w:val="20"/>
@@ -16200,7 +15962,7 @@
       <w:textAlignment w:val="baseline"/>
     </w:pPr>
     <w:rPr>
-      <w:rFonts w:eastAsia="굴림" w:hAnsi="굴림" w:cs="굴림"/>
+      <w:rFonts w:eastAsia="Gulim" w:hAnsi="Gulim" w:cs="Gulim"/>
       <w:color w:val="000000"/>
       <w:spacing w:val="-20"/>
       <w:szCs w:val="20"/>
@@ -16254,7 +16016,7 @@
       <w:jc w:val="left"/>
     </w:pPr>
     <w:rPr>
-      <w:rFonts w:ascii="맑은 고딕" w:eastAsia="맑은 고딕" w:hAnsi="맑은 고딕" w:cs="굴림"/>
+      <w:rFonts w:ascii="맑은 고딕" w:eastAsia="맑은 고딕" w:hAnsi="맑은 고딕" w:cs="Gulim"/>
       <w:kern w:val="0"/>
       <w:sz w:val="22"/>
     </w:rPr>
@@ -16282,7 +16044,7 @@
     <w:link w:val="new1"/>
     <w:rsid w:val="001940D1"/>
     <w:rPr>
-      <w:rFonts w:ascii="맑은 고딕" w:eastAsia="맑은 고딕" w:hAnsi="맑은 고딕" w:cs="굴림"/>
+      <w:rFonts w:ascii="맑은 고딕" w:eastAsia="맑은 고딕" w:hAnsi="맑은 고딕" w:cs="Gulim"/>
       <w:sz w:val="22"/>
       <w:szCs w:val="24"/>
     </w:rPr>
@@ -16292,7 +16054,7 @@
     <w:link w:val="userstorystyle"/>
     <w:rsid w:val="008B2942"/>
     <w:rPr>
-      <w:rFonts w:ascii="맑은 고딕" w:eastAsia="맑은 고딕" w:hAnsi="맑은 고딕" w:cs="굴림"/>
+      <w:rFonts w:ascii="맑은 고딕" w:eastAsia="맑은 고딕" w:hAnsi="맑은 고딕" w:cs="Gulim"/>
       <w:b/>
       <w:bCs/>
       <w:sz w:val="22"/>
@@ -16312,7 +16074,7 @@
       <w:jc w:val="left"/>
     </w:pPr>
     <w:rPr>
-      <w:rFonts w:ascii="굴림" w:eastAsia="굴림" w:hAnsi="굴림" w:cs="굴림"/>
+      <w:rFonts w:ascii="Gulim" w:eastAsia="Gulim" w:hAnsi="Gulim" w:cs="Gulim"/>
       <w:kern w:val="0"/>
       <w:sz w:val="24"/>
     </w:rPr>

</xml_diff>